<commit_message>
CI añadido por edu
</commit_message>
<xml_diff>
--- a/README.docx
+++ b/README.docx
@@ -4,13 +4,17 @@
   <w:body>
     <w:p>
       <w:pPr>
-        <w:pStyle w:val="Heading1"/>
-      </w:pPr>
-      <w:bookmarkStart w:id="9" w:name="_bfb75ec06ed07ad14e614e46fa5d36e7dd4e546"/>
-      <w:r>
-        <w:t xml:space="preserve">Proyecto MiAplicacion</w:t>
-      </w:r>
-      <w:bookmarkEnd w:id="9"/>
+        <w:pStyle w:val="FirstParagraph"/>
+      </w:pPr>
+      <w:r>
+        <w:t xml:space="preserve">Markdown</w:t>
+      </w:r>
+      <w:r>
+        <w:t xml:space="preserve"> </w:t>
+      </w:r>
+      <w:r>
+        <w:t xml:space="preserve"># Proyecto MiAplicacion</w:t>
+      </w:r>
     </w:p>
     <w:p>
       <w:pPr>
@@ -20,15 +24,14 @@
         <w:t xml:space="preserve">Una aplicación sencilla para gestionar tareas diarias.</w:t>
       </w:r>
     </w:p>
+    <w:bookmarkStart w:id="9" w:name="_funcionalidades"/>
     <w:p>
       <w:pPr>
         <w:pStyle w:val="Heading2"/>
       </w:pPr>
-      <w:bookmarkStart w:id="10" w:name="_funcionalidades"/>
       <w:r>
         <w:t xml:space="preserve">🚀 Funcionalidades</w:t>
       </w:r>
-      <w:bookmarkEnd w:id="10"/>
     </w:p>
     <w:p>
       <w:pPr>
@@ -54,15 +57,15 @@
         <w:t xml:space="preserve">Marcar tareas completadas.</w:t>
       </w:r>
     </w:p>
+    <w:bookmarkEnd w:id="9"/>
+    <w:bookmarkStart w:id="11" w:name="_instalación"/>
     <w:p>
       <w:pPr>
         <w:pStyle w:val="Heading2"/>
       </w:pPr>
-      <w:bookmarkStart w:id="11" w:name="_instalación"/>
       <w:r>
         <w:t xml:space="preserve">🛠️ Instalación</w:t>
       </w:r>
-      <w:bookmarkEnd w:id="11"/>
     </w:p>
     <w:p>
       <w:pPr>
@@ -113,7 +116,7 @@
       <w:r>
         <w:t xml:space="preserve"> </w:t>
       </w:r>
-      <w:hyperlink r:id="rId12">
+      <w:hyperlink r:id="rId10">
         <w:r>
           <w:rPr>
             <w:rStyle w:val="Hyperlink"/>
@@ -125,6 +128,7 @@
         <w:t xml:space="preserve">.</w:t>
       </w:r>
     </w:p>
+    <w:bookmarkEnd w:id="11"/>
     <w:sectPr>
       <w:footnotePr>
         <w:numRestart w:val="eachSect"/>
@@ -467,10 +471,10 @@
   <w:docDefaults>
     <w:rPrDefault>
       <w:rPr>
-        <w:rFonts w:asciiTheme="minorHAnsi" w:eastAsiaTheme="minorEastAsia" w:hAnsiTheme="minorHAnsi" w:cstheme="minorBidi"/>
+        <w:rFonts w:asciiTheme="minorHAnsi" w:cstheme="minorBidi" w:eastAsiaTheme="minorEastAsia" w:hAnsiTheme="minorHAnsi"/>
         <w:sz w:val="24"/>
         <w:szCs w:val="24"/>
-        <w:lang w:val="en-US" w:eastAsia="zh-CN" w:bidi="ar-SA"/>
+        <w:lang w:bidi="ar-SA" w:eastAsia="zh-CN" w:val="en-US"/>
       </w:rPr>
     </w:rPrDefault>
     <w:pPrDefault>
@@ -479,35 +483,35 @@
       </w:pPr>
     </w:pPrDefault>
   </w:docDefaults>
-  <w:latentStyles w:defLockedState="0" w:defUIPriority="0" w:defSemiHidden="0" w:defUnhideWhenUsed="0" w:defQFormat="0" w:count="276"/>
-  <w:style w:type="paragraph" w:default="1" w:styleId="Normal">
+  <w:latentStyles w:count="276" w:defLockedState="0" w:defQFormat="0" w:defSemiHidden="0" w:defUIPriority="0" w:defUnhideWhenUsed="0"/>
+  <w:style w:default="1" w:styleId="Normal" w:type="paragraph">
     <w:name w:val="Normal"/>
     <w:qFormat/>
   </w:style>
-  <w:style w:type="paragraph" w:styleId="BodyText">
+  <w:style w:styleId="BodyText" w:type="paragraph">
     <w:name w:val="Body Text"/>
     <w:basedOn w:val="Normal"/>
     <w:link w:val="BodyTextChar"/>
     <w:qFormat/>
     <w:pPr>
-      <w:spacing w:before="180" w:after="180"/>
-    </w:pPr>
-  </w:style>
-  <w:style w:type="paragraph" w:customStyle="1" w:styleId="FirstParagraph">
+      <w:spacing w:after="180" w:before="180"/>
+    </w:pPr>
+  </w:style>
+  <w:style w:customStyle="1" w:styleId="FirstParagraph" w:type="paragraph">
     <w:name w:val="First Paragraph"/>
     <w:basedOn w:val="BodyText"/>
     <w:next w:val="BodyText"/>
     <w:qFormat/>
   </w:style>
-  <w:style w:type="paragraph" w:customStyle="1" w:styleId="Compact">
+  <w:style w:customStyle="1" w:styleId="Compact" w:type="paragraph">
     <w:name w:val="Compact"/>
     <w:basedOn w:val="BodyText"/>
     <w:qFormat/>
     <w:pPr>
-      <w:spacing w:before="36" w:after="36"/>
-    </w:pPr>
-  </w:style>
-  <w:style w:type="paragraph" w:styleId="Title">
+      <w:spacing w:after="36" w:before="36"/>
+    </w:pPr>
+  </w:style>
+  <w:style w:styleId="Title" w:type="paragraph">
     <w:name w:val="Title"/>
     <w:basedOn w:val="Normal"/>
     <w:next w:val="BodyText"/>
@@ -521,24 +525,24 @@
       <w:jc w:val="center"/>
     </w:pPr>
     <w:rPr>
-      <w:rFonts w:asciiTheme="majorHAnsi" w:eastAsiaTheme="majorEastAsia" w:hAnsiTheme="majorHAnsi" w:cstheme="majorBidi"/>
+      <w:rFonts w:asciiTheme="majorHAnsi" w:cstheme="majorBidi" w:eastAsiaTheme="majorEastAsia" w:hAnsiTheme="majorHAnsi"/>
       <w:sz w:val="56"/>
       <w:szCs w:val="56"/>
     </w:rPr>
   </w:style>
-  <w:style w:type="character" w:customStyle="1" w:styleId="TitleChar">
+  <w:style w:customStyle="1" w:styleId="TitleChar" w:type="character">
     <w:name w:val="Title Char"/>
     <w:basedOn w:val="DefaultParagraphFont"/>
     <w:link w:val="Title"/>
     <w:uiPriority w:val="10"/>
     <w:rsid w:val="00A10FD9"/>
     <w:rPr>
-      <w:rFonts w:asciiTheme="majorHAnsi" w:eastAsiaTheme="majorEastAsia" w:hAnsiTheme="majorHAnsi" w:cstheme="majorBidi"/>
+      <w:rFonts w:asciiTheme="majorHAnsi" w:cstheme="majorBidi" w:eastAsiaTheme="majorEastAsia" w:hAnsiTheme="majorHAnsi"/>
       <w:sz w:val="56"/>
       <w:szCs w:val="56"/>
     </w:rPr>
   </w:style>
-  <w:style w:type="paragraph" w:styleId="Subtitle">
+  <w:style w:styleId="Subtitle" w:type="paragraph">
     <w:name w:val="Subtitle"/>
     <w:basedOn w:val="Title"/>
     <w:next w:val="BodyText"/>
@@ -552,27 +556,27 @@
       </w:numPr>
     </w:pPr>
     <w:rPr>
-      <w:rFonts w:eastAsiaTheme="majorEastAsia" w:cstheme="majorBidi"/>
+      <w:rFonts w:cstheme="majorBidi" w:eastAsiaTheme="majorEastAsia"/>
       <w:spacing w:val="15"/>
       <w:sz w:val="28"/>
       <w:szCs w:val="28"/>
     </w:rPr>
   </w:style>
-  <w:style w:type="character" w:customStyle="1" w:styleId="SubtitleChar">
+  <w:style w:customStyle="1" w:styleId="SubtitleChar" w:type="character">
     <w:name w:val="Subtitle Char"/>
     <w:basedOn w:val="DefaultParagraphFont"/>
     <w:link w:val="Subtitle"/>
     <w:uiPriority w:val="11"/>
     <w:rsid w:val="00A10FD9"/>
     <w:rPr>
-      <w:rFonts w:eastAsiaTheme="majorEastAsia" w:cstheme="majorBidi"/>
-      <w:color w:val="595959" w:themeColor="text1" w:themeTint="A6"/>
+      <w:rFonts w:cstheme="majorBidi" w:eastAsiaTheme="majorEastAsia"/>
+      <w:color w:themeColor="text1" w:themeTint="A6" w:val="595959"/>
       <w:spacing w:val="15"/>
       <w:sz w:val="28"/>
       <w:szCs w:val="28"/>
     </w:rPr>
   </w:style>
-  <w:style w:type="paragraph" w:customStyle="1" w:styleId="Author">
+  <w:style w:customStyle="1" w:styleId="Author" w:type="paragraph">
     <w:name w:val="Author"/>
     <w:basedOn w:val="Title"/>
     <w:next w:val="BodyText"/>
@@ -586,7 +590,7 @@
       <w:szCs w:val="24"/>
     </w:rPr>
   </w:style>
-  <w:style w:type="paragraph" w:styleId="Date">
+  <w:style w:styleId="Date" w:type="paragraph">
     <w:name w:val="Date"/>
     <w:basedOn w:val="Title"/>
     <w:next w:val="BodyText"/>
@@ -600,7 +604,7 @@
       <w:szCs w:val="24"/>
     </w:rPr>
   </w:style>
-  <w:style w:type="paragraph" w:customStyle="1" w:styleId="AbstractTitle">
+  <w:style w:customStyle="1" w:styleId="AbstractTitle" w:type="paragraph">
     <w:name w:val="Abstract Title"/>
     <w:basedOn w:val="Normal"/>
     <w:next w:val="Abstract"/>
@@ -608,7 +612,7 @@
     <w:pPr>
       <w:keepNext/>
       <w:keepLines/>
-      <w:spacing w:before="300" w:after="0"/>
+      <w:spacing w:after="0" w:before="300"/>
       <w:jc w:val="center"/>
     </w:pPr>
     <w:rPr>
@@ -617,7 +621,7 @@
       <w:szCs w:val="20"/>
     </w:rPr>
   </w:style>
-  <w:style w:type="paragraph" w:customStyle="1" w:styleId="Abstract">
+  <w:style w:customStyle="1" w:styleId="Abstract" w:type="paragraph">
     <w:name w:val="Abstract"/>
     <w:basedOn w:val="Normal"/>
     <w:next w:val="BodyText"/>
@@ -625,14 +629,14 @@
     <w:pPr>
       <w:keepNext/>
       <w:keepLines/>
-      <w:spacing w:before="100" w:after="300"/>
+      <w:spacing w:after="300" w:before="100"/>
     </w:pPr>
     <w:rPr>
       <w:sz w:val="20"/>
       <w:szCs w:val="20"/>
     </w:rPr>
   </w:style>
-  <w:style w:type="paragraph" w:styleId="Bibliography">
+  <w:style w:styleId="Bibliography" w:type="paragraph">
     <w:name w:val="Bibliography"/>
     <w:basedOn w:val="Normal"/>
     <w:next w:val="Bibliography"/>
@@ -640,7 +644,7 @@
     <w:pPr/>
     <w:rPr/>
   </w:style>
-  <w:style w:type="paragraph" w:styleId="Heading1">
+  <w:style w:styleId="Heading1" w:type="paragraph">
     <w:name w:val="heading 1"/>
     <w:basedOn w:val="Normal"/>
     <w:next w:val="BodyText"/>
@@ -651,17 +655,17 @@
     <w:pPr>
       <w:keepNext/>
       <w:keepLines/>
-      <w:spacing w:before="360" w:after="80"/>
+      <w:spacing w:after="80" w:before="360"/>
       <w:outlineLvl w:val="0"/>
     </w:pPr>
     <w:rPr>
-      <w:rFonts w:asciiTheme="majorHAnsi" w:eastAsiaTheme="majorEastAsia" w:hAnsiTheme="majorHAnsi" w:cstheme="majorBidi"/>
-      <w:color w:val="0F4761" w:themeColor="accent1" w:themeShade="BF"/>
+      <w:rFonts w:asciiTheme="majorHAnsi" w:cstheme="majorBidi" w:eastAsiaTheme="majorEastAsia" w:hAnsiTheme="majorHAnsi"/>
+      <w:color w:themeColor="accent1" w:themeShade="BF" w:val="0F4761"/>
       <w:sz w:val="40"/>
       <w:szCs w:val="40"/>
     </w:rPr>
   </w:style>
-  <w:style w:type="paragraph" w:styleId="Heading2">
+  <w:style w:styleId="Heading2" w:type="paragraph">
     <w:name w:val="heading 2"/>
     <w:basedOn w:val="Normal"/>
     <w:next w:val="BodyText"/>
@@ -674,17 +678,17 @@
     <w:pPr>
       <w:keepNext/>
       <w:keepLines/>
-      <w:spacing w:before="160" w:after="80"/>
+      <w:spacing w:after="80" w:before="160"/>
       <w:outlineLvl w:val="1"/>
     </w:pPr>
     <w:rPr>
-      <w:rFonts w:asciiTheme="majorHAnsi" w:eastAsiaTheme="majorEastAsia" w:hAnsiTheme="majorHAnsi" w:cstheme="majorBidi"/>
-      <w:color w:val="0F4761" w:themeColor="accent1" w:themeShade="BF"/>
+      <w:rFonts w:asciiTheme="majorHAnsi" w:cstheme="majorBidi" w:eastAsiaTheme="majorEastAsia" w:hAnsiTheme="majorHAnsi"/>
+      <w:color w:themeColor="accent1" w:themeShade="BF" w:val="0F4761"/>
       <w:sz w:val="32"/>
       <w:szCs w:val="32"/>
     </w:rPr>
   </w:style>
-  <w:style w:type="paragraph" w:styleId="Heading3">
+  <w:style w:styleId="Heading3" w:type="paragraph">
     <w:name w:val="heading 3"/>
     <w:basedOn w:val="Normal"/>
     <w:next w:val="BodyText"/>
@@ -697,17 +701,17 @@
     <w:pPr>
       <w:keepNext/>
       <w:keepLines/>
-      <w:spacing w:before="160" w:after="80"/>
+      <w:spacing w:after="80" w:before="160"/>
       <w:outlineLvl w:val="2"/>
     </w:pPr>
     <w:rPr>
-      <w:rFonts w:eastAsiaTheme="majorEastAsia" w:cstheme="majorBidi"/>
-      <w:color w:val="0F4761" w:themeColor="accent1" w:themeShade="BF"/>
+      <w:rFonts w:cstheme="majorBidi" w:eastAsiaTheme="majorEastAsia"/>
+      <w:color w:themeColor="accent1" w:themeShade="BF" w:val="0F4761"/>
       <w:sz w:val="28"/>
       <w:szCs w:val="28"/>
     </w:rPr>
   </w:style>
-  <w:style w:type="paragraph" w:styleId="Heading4">
+  <w:style w:styleId="Heading4" w:type="paragraph">
     <w:name w:val="heading 4"/>
     <w:basedOn w:val="Normal"/>
     <w:next w:val="BodyText"/>
@@ -720,17 +724,17 @@
     <w:pPr>
       <w:keepNext/>
       <w:keepLines/>
-      <w:spacing w:before="80" w:after="40"/>
+      <w:spacing w:after="40" w:before="80"/>
       <w:outlineLvl w:val="3"/>
     </w:pPr>
     <w:rPr>
-      <w:rFonts w:eastAsiaTheme="majorEastAsia" w:cstheme="majorBidi"/>
+      <w:rFonts w:cstheme="majorBidi" w:eastAsiaTheme="majorEastAsia"/>
       <w:i/>
       <w:iCs/>
-      <w:color w:val="0F4761" w:themeColor="accent1" w:themeShade="BF"/>
-    </w:rPr>
-  </w:style>
-  <w:style w:type="paragraph" w:styleId="Heading5">
+      <w:color w:themeColor="accent1" w:themeShade="BF" w:val="0F4761"/>
+    </w:rPr>
+  </w:style>
+  <w:style w:styleId="Heading5" w:type="paragraph">
     <w:name w:val="heading 5"/>
     <w:basedOn w:val="Normal"/>
     <w:next w:val="BodyText"/>
@@ -743,15 +747,15 @@
     <w:pPr>
       <w:keepNext/>
       <w:keepLines/>
-      <w:spacing w:before="80" w:after="40"/>
+      <w:spacing w:after="40" w:before="80"/>
       <w:outlineLvl w:val="4"/>
     </w:pPr>
     <w:rPr>
-      <w:rFonts w:eastAsiaTheme="majorEastAsia" w:cstheme="majorBidi"/>
-      <w:color w:val="0F4761" w:themeColor="accent1" w:themeShade="BF"/>
-    </w:rPr>
-  </w:style>
-  <w:style w:type="paragraph" w:styleId="Heading6">
+      <w:rFonts w:cstheme="majorBidi" w:eastAsiaTheme="majorEastAsia"/>
+      <w:color w:themeColor="accent1" w:themeShade="BF" w:val="0F4761"/>
+    </w:rPr>
+  </w:style>
+  <w:style w:styleId="Heading6" w:type="paragraph">
     <w:name w:val="heading 6"/>
     <w:basedOn w:val="Normal"/>
     <w:next w:val="BodyText"/>
@@ -764,17 +768,17 @@
     <w:pPr>
       <w:keepNext/>
       <w:keepLines/>
-      <w:spacing w:before="40" w:after="0"/>
+      <w:spacing w:after="0" w:before="40"/>
       <w:outlineLvl w:val="5"/>
     </w:pPr>
     <w:rPr>
-      <w:rFonts w:eastAsiaTheme="majorEastAsia" w:cstheme="majorBidi"/>
+      <w:rFonts w:cstheme="majorBidi" w:eastAsiaTheme="majorEastAsia"/>
       <w:i/>
       <w:iCs/>
-      <w:color w:val="595959" w:themeColor="text1" w:themeTint="A6"/>
-    </w:rPr>
-  </w:style>
-  <w:style w:type="paragraph" w:styleId="Heading7">
+      <w:color w:themeColor="text1" w:themeTint="A6" w:val="595959"/>
+    </w:rPr>
+  </w:style>
+  <w:style w:styleId="Heading7" w:type="paragraph">
     <w:name w:val="heading 7"/>
     <w:basedOn w:val="Normal"/>
     <w:next w:val="BodyText"/>
@@ -787,15 +791,15 @@
     <w:pPr>
       <w:keepNext/>
       <w:keepLines/>
-      <w:spacing w:before="40" w:after="0"/>
+      <w:spacing w:after="0" w:before="40"/>
       <w:outlineLvl w:val="6"/>
     </w:pPr>
     <w:rPr>
-      <w:rFonts w:eastAsiaTheme="majorEastAsia" w:cstheme="majorBidi"/>
-      <w:color w:val="595959" w:themeColor="text1" w:themeTint="A6"/>
-    </w:rPr>
-  </w:style>
-  <w:style w:type="paragraph" w:styleId="Heading8">
+      <w:rFonts w:cstheme="majorBidi" w:eastAsiaTheme="majorEastAsia"/>
+      <w:color w:themeColor="text1" w:themeTint="A6" w:val="595959"/>
+    </w:rPr>
+  </w:style>
+  <w:style w:styleId="Heading8" w:type="paragraph">
     <w:name w:val="heading 8"/>
     <w:basedOn w:val="Normal"/>
     <w:next w:val="BodyText"/>
@@ -812,13 +816,13 @@
       <w:outlineLvl w:val="7"/>
     </w:pPr>
     <w:rPr>
-      <w:rFonts w:eastAsiaTheme="majorEastAsia" w:cstheme="majorBidi"/>
+      <w:rFonts w:cstheme="majorBidi" w:eastAsiaTheme="majorEastAsia"/>
       <w:i/>
       <w:iCs/>
-      <w:color w:val="272727" w:themeColor="text1" w:themeTint="D8"/>
-    </w:rPr>
-  </w:style>
-  <w:style w:type="paragraph" w:styleId="Heading9">
+      <w:color w:themeColor="text1" w:themeTint="D8" w:val="272727"/>
+    </w:rPr>
+  </w:style>
+  <w:style w:styleId="Heading9" w:type="paragraph">
     <w:name w:val="heading 9"/>
     <w:basedOn w:val="Normal"/>
     <w:next w:val="BodyText"/>
@@ -835,24 +839,24 @@
       <w:outlineLvl w:val="8"/>
     </w:pPr>
     <w:rPr>
-      <w:rFonts w:eastAsiaTheme="majorEastAsia" w:cstheme="majorBidi"/>
-      <w:color w:val="272727" w:themeColor="text1" w:themeTint="D8"/>
-    </w:rPr>
-  </w:style>
-  <w:style w:type="character" w:customStyle="1" w:styleId="Heading1Char">
+      <w:rFonts w:cstheme="majorBidi" w:eastAsiaTheme="majorEastAsia"/>
+      <w:color w:themeColor="text1" w:themeTint="D8" w:val="272727"/>
+    </w:rPr>
+  </w:style>
+  <w:style w:customStyle="1" w:styleId="Heading1Char" w:type="character">
     <w:name w:val="Heading 1 Char"/>
     <w:basedOn w:val="DefaultParagraphFont"/>
     <w:link w:val="Heading1"/>
     <w:uiPriority w:val="9"/>
     <w:rsid w:val="00A10FD9"/>
     <w:rPr>
-      <w:rFonts w:asciiTheme="majorHAnsi" w:eastAsiaTheme="majorEastAsia" w:hAnsiTheme="majorHAnsi" w:cstheme="majorBidi"/>
-      <w:color w:val="0F4761" w:themeColor="accent1" w:themeShade="BF"/>
+      <w:rFonts w:asciiTheme="majorHAnsi" w:cstheme="majorBidi" w:eastAsiaTheme="majorEastAsia" w:hAnsiTheme="majorHAnsi"/>
+      <w:color w:themeColor="accent1" w:themeShade="BF" w:val="0F4761"/>
       <w:sz w:val="40"/>
       <w:szCs w:val="40"/>
     </w:rPr>
   </w:style>
-  <w:style w:type="character" w:customStyle="1" w:styleId="Heading2Char">
+  <w:style w:customStyle="1" w:styleId="Heading2Char" w:type="character">
     <w:name w:val="Heading 2 Char"/>
     <w:basedOn w:val="DefaultParagraphFont"/>
     <w:link w:val="Heading2"/>
@@ -860,13 +864,13 @@
     <w:semiHidden/>
     <w:rsid w:val="00A10FD9"/>
     <w:rPr>
-      <w:rFonts w:asciiTheme="majorHAnsi" w:eastAsiaTheme="majorEastAsia" w:hAnsiTheme="majorHAnsi" w:cstheme="majorBidi"/>
-      <w:color w:val="0F4761" w:themeColor="accent1" w:themeShade="BF"/>
+      <w:rFonts w:asciiTheme="majorHAnsi" w:cstheme="majorBidi" w:eastAsiaTheme="majorEastAsia" w:hAnsiTheme="majorHAnsi"/>
+      <w:color w:themeColor="accent1" w:themeShade="BF" w:val="0F4761"/>
       <w:sz w:val="32"/>
       <w:szCs w:val="32"/>
     </w:rPr>
   </w:style>
-  <w:style w:type="character" w:customStyle="1" w:styleId="Heading3Char">
+  <w:style w:customStyle="1" w:styleId="Heading3Char" w:type="character">
     <w:name w:val="Heading 3 Char"/>
     <w:basedOn w:val="DefaultParagraphFont"/>
     <w:link w:val="Heading3"/>
@@ -874,13 +878,13 @@
     <w:semiHidden/>
     <w:rsid w:val="00A10FD9"/>
     <w:rPr>
-      <w:rFonts w:eastAsiaTheme="majorEastAsia" w:cstheme="majorBidi"/>
-      <w:color w:val="0F4761" w:themeColor="accent1" w:themeShade="BF"/>
+      <w:rFonts w:cstheme="majorBidi" w:eastAsiaTheme="majorEastAsia"/>
+      <w:color w:themeColor="accent1" w:themeShade="BF" w:val="0F4761"/>
       <w:sz w:val="28"/>
       <w:szCs w:val="28"/>
     </w:rPr>
   </w:style>
-  <w:style w:type="character" w:customStyle="1" w:styleId="Heading4Char">
+  <w:style w:customStyle="1" w:styleId="Heading4Char" w:type="character">
     <w:name w:val="Heading 4 Char"/>
     <w:basedOn w:val="DefaultParagraphFont"/>
     <w:link w:val="Heading4"/>
@@ -888,13 +892,13 @@
     <w:semiHidden/>
     <w:rsid w:val="00A10FD9"/>
     <w:rPr>
-      <w:rFonts w:eastAsiaTheme="majorEastAsia" w:cstheme="majorBidi"/>
+      <w:rFonts w:cstheme="majorBidi" w:eastAsiaTheme="majorEastAsia"/>
       <w:i/>
       <w:iCs/>
-      <w:color w:val="0F4761" w:themeColor="accent1" w:themeShade="BF"/>
-    </w:rPr>
-  </w:style>
-  <w:style w:type="character" w:customStyle="1" w:styleId="Heading5Char">
+      <w:color w:themeColor="accent1" w:themeShade="BF" w:val="0F4761"/>
+    </w:rPr>
+  </w:style>
+  <w:style w:customStyle="1" w:styleId="Heading5Char" w:type="character">
     <w:name w:val="Heading 5 Char"/>
     <w:basedOn w:val="DefaultParagraphFont"/>
     <w:link w:val="Heading5"/>
@@ -902,11 +906,11 @@
     <w:semiHidden/>
     <w:rsid w:val="00A10FD9"/>
     <w:rPr>
-      <w:rFonts w:eastAsiaTheme="majorEastAsia" w:cstheme="majorBidi"/>
-      <w:color w:val="0F4761" w:themeColor="accent1" w:themeShade="BF"/>
-    </w:rPr>
-  </w:style>
-  <w:style w:type="character" w:customStyle="1" w:styleId="Heading6Char">
+      <w:rFonts w:cstheme="majorBidi" w:eastAsiaTheme="majorEastAsia"/>
+      <w:color w:themeColor="accent1" w:themeShade="BF" w:val="0F4761"/>
+    </w:rPr>
+  </w:style>
+  <w:style w:customStyle="1" w:styleId="Heading6Char" w:type="character">
     <w:name w:val="Heading 6 Char"/>
     <w:basedOn w:val="DefaultParagraphFont"/>
     <w:link w:val="Heading6"/>
@@ -914,13 +918,13 @@
     <w:semiHidden/>
     <w:rsid w:val="00A10FD9"/>
     <w:rPr>
-      <w:rFonts w:eastAsiaTheme="majorEastAsia" w:cstheme="majorBidi"/>
+      <w:rFonts w:cstheme="majorBidi" w:eastAsiaTheme="majorEastAsia"/>
       <w:i/>
       <w:iCs/>
-      <w:color w:val="595959" w:themeColor="text1" w:themeTint="A6"/>
-    </w:rPr>
-  </w:style>
-  <w:style w:type="character" w:customStyle="1" w:styleId="Heading7Char">
+      <w:color w:themeColor="text1" w:themeTint="A6" w:val="595959"/>
+    </w:rPr>
+  </w:style>
+  <w:style w:customStyle="1" w:styleId="Heading7Char" w:type="character">
     <w:name w:val="Heading 7 Char"/>
     <w:basedOn w:val="DefaultParagraphFont"/>
     <w:link w:val="Heading7"/>
@@ -928,11 +932,11 @@
     <w:semiHidden/>
     <w:rsid w:val="00A10FD9"/>
     <w:rPr>
-      <w:rFonts w:eastAsiaTheme="majorEastAsia" w:cstheme="majorBidi"/>
-      <w:color w:val="595959" w:themeColor="text1" w:themeTint="A6"/>
-    </w:rPr>
-  </w:style>
-  <w:style w:type="character" w:customStyle="1" w:styleId="Heading8Char">
+      <w:rFonts w:cstheme="majorBidi" w:eastAsiaTheme="majorEastAsia"/>
+      <w:color w:themeColor="text1" w:themeTint="A6" w:val="595959"/>
+    </w:rPr>
+  </w:style>
+  <w:style w:customStyle="1" w:styleId="Heading8Char" w:type="character">
     <w:name w:val="Heading 8 Char"/>
     <w:basedOn w:val="DefaultParagraphFont"/>
     <w:link w:val="Heading8"/>
@@ -940,13 +944,13 @@
     <w:semiHidden/>
     <w:rsid w:val="00A10FD9"/>
     <w:rPr>
-      <w:rFonts w:eastAsiaTheme="majorEastAsia" w:cstheme="majorBidi"/>
+      <w:rFonts w:cstheme="majorBidi" w:eastAsiaTheme="majorEastAsia"/>
       <w:i/>
       <w:iCs/>
-      <w:color w:val="272727" w:themeColor="text1" w:themeTint="D8"/>
-    </w:rPr>
-  </w:style>
-  <w:style w:type="character" w:customStyle="1" w:styleId="Heading9Char">
+      <w:color w:themeColor="text1" w:themeTint="D8" w:val="272727"/>
+    </w:rPr>
+  </w:style>
+  <w:style w:customStyle="1" w:styleId="Heading9Char" w:type="character">
     <w:name w:val="Heading 9 Char"/>
     <w:basedOn w:val="DefaultParagraphFont"/>
     <w:link w:val="Heading9"/>
@@ -954,11 +958,11 @@
     <w:semiHidden/>
     <w:rsid w:val="00A10FD9"/>
     <w:rPr>
-      <w:rFonts w:eastAsiaTheme="majorEastAsia" w:cstheme="majorBidi"/>
-      <w:color w:val="272727" w:themeColor="text1" w:themeTint="D8"/>
-    </w:rPr>
-  </w:style>
-  <w:style w:type="paragraph" w:styleId="BlockText">
+      <w:rFonts w:cstheme="majorBidi" w:eastAsiaTheme="majorEastAsia"/>
+      <w:color w:themeColor="text1" w:themeTint="D8" w:val="272727"/>
+    </w:rPr>
+  </w:style>
+  <w:style w:styleId="BlockText" w:type="paragraph">
     <w:name w:val="Block Text"/>
     <w:basedOn w:val="BodyText"/>
     <w:next w:val="BodyText"/>
@@ -966,11 +970,11 @@
     <w:unhideWhenUsed/>
     <w:qFormat/>
     <w:pPr>
-      <w:spacing w:before="100" w:after="100"/>
+      <w:spacing w:after="100" w:before="100"/>
       <w:ind w:firstLine="0" w:left="480" w:right="480"/>
     </w:pPr>
   </w:style>
-  <w:style w:type="paragraph" w:styleId="FootnoteText">
+  <w:style w:styleId="FootnoteText" w:type="paragraph">
     <w:name w:val="Footnote Text"/>
     <w:basedOn w:val="Normal"/>
     <w:next w:val="FootnoteText"/>
@@ -978,7 +982,7 @@
     <w:unhideWhenUsed/>
     <w:qFormat/>
   </w:style>
-  <w:style w:type="paragraph" w:styleId="FootnoteBlockText">
+  <w:style w:styleId="FootnoteBlockText" w:type="paragraph">
     <w:name w:val="Footnote Block Text"/>
     <w:basedOn w:val="FootnoteText"/>
     <w:next w:val="FootnoteText"/>
@@ -986,26 +990,28 @@
     <w:unhideWhenUsed/>
     <w:qFormat/>
     <w:pPr>
-      <w:spacing w:before="100" w:after="100"/>
+      <w:spacing w:after="100" w:before="100"/>
       <w:ind w:firstLine="0" w:left="480" w:right="480"/>
     </w:pPr>
   </w:style>
-  <w:style w:type="character" w:default="1" w:styleId="DefaultParagraphFont">
+  <w:style w:default="1" w:styleId="DefaultParagraphFont" w:type="character">
     <w:name w:val="Default Paragraph Font"/>
     <w:semiHidden/>
     <w:unhideWhenUsed/>
   </w:style>
-  <w:style w:type="table" w:default="1" w:styleId="Table">
+  <w:style w:default="1" w:styleId="Table" w:type="table">
     <w:name w:val="Table"/>
     <w:basedOn w:val="TableNormal"/>
+    <w:semiHidden/>
+    <w:unhideWhenUsed/>
     <w:qFormat/>
     <w:tblPr>
-      <w:tblInd w:w="0" w:type="dxa"/>
+      <w:tblInd w:type="dxa" w:w="0"/>
       <w:tblCellMar>
-        <w:top w:w="0" w:type="dxa"/>
-        <w:left w:w="108" w:type="dxa"/>
-        <w:bottom w:w="0" w:type="dxa"/>
-        <w:right w:w="108" w:type="dxa"/>
+        <w:top w:type="dxa" w:w="0"/>
+        <w:left w:type="dxa" w:w="108"/>
+        <w:bottom w:type="dxa" w:w="0"/>
+        <w:right w:type="dxa" w:w="108"/>
       </w:tblCellMar>
     </w:tblPr>
     <w:tblStylePr w:type="firstRow">
@@ -1017,7 +1023,7 @@
       </w:tcPr>
     </w:tblStylePr>
   </w:style>
-  <w:style w:type="paragraph" w:customStyle="1" w:styleId="DefinitionTerm">
+  <w:style w:customStyle="1" w:styleId="DefinitionTerm" w:type="paragraph">
     <w:name w:val="Definition Term"/>
     <w:basedOn w:val="Normal"/>
     <w:next w:val="Definition"/>
@@ -1030,49 +1036,49 @@
       <w:b/>
     </w:rPr>
   </w:style>
-  <w:style w:type="paragraph" w:customStyle="1" w:styleId="Definition">
+  <w:style w:customStyle="1" w:styleId="Definition" w:type="paragraph">
     <w:name w:val="Definition"/>
     <w:basedOn w:val="Normal"/>
   </w:style>
-  <w:style w:type="paragraph" w:styleId="Caption">
+  <w:style w:styleId="Caption" w:type="paragraph">
     <w:name w:val="Caption"/>
     <w:basedOn w:val="Normal"/>
     <w:link w:val="BodyTextChar"/>
     <w:pPr>
-      <w:spacing w:before="0" w:after="120"/>
+      <w:spacing w:after="120" w:before="0"/>
     </w:pPr>
     <w:rPr>
       <w:i/>
     </w:rPr>
   </w:style>
-  <w:style w:type="paragraph" w:customStyle="1" w:styleId="TableCaption">
+  <w:style w:customStyle="1" w:styleId="TableCaption" w:type="paragraph">
     <w:name w:val="Table Caption"/>
     <w:basedOn w:val="Caption"/>
     <w:pPr>
       <w:keepNext/>
     </w:pPr>
   </w:style>
-  <w:style w:type="paragraph" w:customStyle="1" w:styleId="ImageCaption">
+  <w:style w:customStyle="1" w:styleId="ImageCaption" w:type="paragraph">
     <w:name w:val="Image Caption"/>
     <w:basedOn w:val="Caption"/>
   </w:style>
-  <w:style w:type="paragraph" w:customStyle="1" w:styleId="Figure">
+  <w:style w:customStyle="1" w:styleId="Figure" w:type="paragraph">
     <w:name w:val="Figure"/>
     <w:basedOn w:val="Normal"/>
   </w:style>
-  <w:style w:type="paragraph" w:customStyle="1" w:styleId="CaptionedFigure">
+  <w:style w:customStyle="1" w:styleId="CaptionedFigure" w:type="paragraph">
     <w:name w:val="Captioned Figure"/>
     <w:basedOn w:val="Figure"/>
     <w:pPr>
       <w:keepNext/>
     </w:pPr>
   </w:style>
-  <w:style w:type="character" w:customStyle="1" w:styleId="BodyTextChar">
+  <w:style w:customStyle="1" w:styleId="BodyTextChar" w:type="character">
     <w:name w:val="Body Text Char"/>
     <w:basedOn w:val="DefaultParagraphFont"/>
     <w:link w:val="BodyText"/>
   </w:style>
-  <w:style w:type="character" w:customStyle="1" w:styleId="VerbatimChar">
+  <w:style w:customStyle="1" w:styleId="VerbatimChar" w:type="character">
     <w:name w:val="Verbatim Char"/>
     <w:basedOn w:val="BodyTextChar"/>
     <w:rPr>
@@ -1080,25 +1086,25 @@
       <w:sz w:val="22"/>
     </w:rPr>
   </w:style>
-  <w:style w:type="character" w:customStyle="1" w:styleId="SectionNumber">
+  <w:style w:customStyle="1" w:styleId="SectionNumber" w:type="character">
     <w:name w:val="Section Number"/>
     <w:basedOn w:val="BodyTextChar"/>
   </w:style>
-  <w:style w:type="character" w:styleId="FootnoteReference">
+  <w:style w:styleId="FootnoteReference" w:type="character">
     <w:name w:val="Footnote Reference"/>
     <w:basedOn w:val="BodyTextChar"/>
     <w:rPr>
       <w:vertAlign w:val="superscript"/>
     </w:rPr>
   </w:style>
-  <w:style w:type="character" w:styleId="Hyperlink">
+  <w:style w:styleId="Hyperlink" w:type="character">
     <w:name w:val="Hyperlink"/>
     <w:basedOn w:val="BodyTextChar"/>
     <w:rPr>
-      <w:color w:val="4F81BD" w:themeColor="accent1"/>
-    </w:rPr>
-  </w:style>
-  <w:style w:type="paragraph" w:styleId="TOCHeading">
+      <w:color w:themeColor="accent1" w:val="4F81BD"/>
+    </w:rPr>
+  </w:style>
+  <w:style w:styleId="TOCHeading" w:type="paragraph">
     <w:name w:val="TOC Heading"/>
     <w:basedOn w:val="Heading1"/>
     <w:next w:val="BodyText"/>
@@ -1110,10 +1116,10 @@
       <w:outlineLvl w:val="9"/>
     </w:pPr>
     <w:rPr>
-      <w:rFonts w:asciiTheme="majorHAnsi" w:eastAsiaTheme="majorEastAsia" w:hAnsiTheme="majorHAnsi" w:cstheme="majorBidi"/>
+      <w:rFonts w:asciiTheme="majorHAnsi" w:cstheme="majorBidi" w:eastAsiaTheme="majorEastAsia" w:hAnsiTheme="majorHAnsi"/>
       <w:b w:val="0"/>
       <w:bCs w:val="0"/>
-      <w:color w:val="365F91" w:themeColor="accent1" w:themeShade="BF"/>
+      <w:color w:themeColor="accent1" w:themeShade="BF" w:val="365F91"/>
     </w:rPr>
   </w:style>
   <w:style w:type="paragraph" w:customStyle="1" w:styleId="SourceCode">

</xml_diff>